<commit_message>
human elder part 1
</commit_message>
<xml_diff>
--- a/Scenarios/Dev-Log.docx
+++ b/Scenarios/Dev-Log.docx
@@ -73,6 +73,21 @@
     <w:p>
       <w:r>
         <w:t>1:30</w:t>
+      </w:r>
+    </w:p>
+    <w:p>
+      <w:r>
+        <w:t>Post 4</w:t>
+      </w:r>
+    </w:p>
+    <w:p>
+      <w:r>
+        <w:t>Human dialogue for elder part 1</w:t>
+      </w:r>
+    </w:p>
+    <w:p>
+      <w:r>
+        <w:t>1:25</w:t>
       </w:r>
     </w:p>
     <w:p/>

</xml_diff>